<commit_message>
Add author details, Wind data provenance (Table S15), repository link
</commit_message>
<xml_diff>
--- a/manuscript/ESWA_Manuscript_anonymized.docx
+++ b/manuscript/ESWA_Manuscript_anonymized.docx
@@ -268,7 +268,7 @@
         <w:pStyle w:val="FirstParagraph"/>
       </w:pPr>
       <w:r>
-        <w:t xml:space="preserve">The replication uses the two regression datasets of the authors’ earlier working paper, which was circulated internally and never submitted. The CI series and macro controls were exported from the Wind Economic Database [WIND SERIES CODES AND EXPORT DATE TO BE INSERTED BY THE AUTHORS]; SHA-256 checksums of the files are recorded in the replication package. Panel A measures CI by the currency’s share of SWIFT payments for China, Hungary, Mexico, Poland, the Russian Federation and South Africa (2012-08 to 2021-12, N = 678). Panel B measures CI by the domestic currency’s share of FX-turnover and adds Brazil, India and Korea (2012-01 to 2022-12, N = 1,188). IQ is the mean of the six WGI dimensions. The six risk indicators are CPI volatility (CPI_Vol), FX-reserve volatility (FX_Vol), consumption volatility (CE_Vol), real exchange-rate volatility (ER_Vol), the credit-to-GDP gap (CG_Gap) and unemployment (Unemp). The Panel B ER_Vol series is available for only 8 of the nine countries, so that regression uses N = 1056. Table 1 summarises the samples.</w:t>
+        <w:t xml:space="preserve">The replication uses the two regression datasets of the authors’ earlier working paper, which was circulated internally and never submitted. The CI series and macro controls were exported from the Wind Economic Database and compiled into the regression datasets on 13 June 2023; the original Wind series codes were not retained, so Supplementary Table S15 documents the variables by their dataset column names; SHA-256 checksums of the files are recorded in the replication package. Panel A measures CI by the currency’s share of SWIFT payments for China, Hungary, Mexico, Poland, the Russian Federation and South Africa (2012-08 to 2021-12, N = 678). Panel B measures CI by the domestic currency’s share of FX-turnover and adds Brazil, India and Korea (2012-01 to 2022-12, N = 1,188). IQ is the mean of the six WGI dimensions. The six risk indicators are CPI volatility (CPI_Vol), FX-reserve volatility (FX_Vol), consumption volatility (CE_Vol), real exchange-rate volatility (ER_Vol), the credit-to-GDP gap (CG_Gap) and unemployment (Unemp). The Panel B ER_Vol series is available for only 8 of the nine countries, so that regression uses N = 1056. Table 1 summarises the samples.</w:t>
       </w:r>
     </w:p>
     <w:p>
@@ -12297,7 +12297,7 @@
         <w:pStyle w:val="FirstParagraph"/>
       </w:pPr>
       <w:r>
-        <w:t xml:space="preserve">BIS, IMF and World Bank data are public; the Wind exports are licensed and cannot be redistributed, but series codes and export dates are listed in the replication package. Code, split definitions, the confirmation protocol and all row-level predictions are provided in the replication package [repository link withheld for double-anonymous review].</w:t>
+        <w:t xml:space="preserve">BIS, IMF and World Bank data are public; the Wind-based regression datasets (compiled on 13 June 2023) are licensed and cannot be redistributed, but their variables are documented in Supplementary Table S15 and their SHA-256 checksums are included in the replication package. Code, split definitions, the confirmation protocol and all row-level predictions are provided in the replication package [repository link withheld for double-anonymous review].</w:t>
       </w:r>
     </w:p>
     <w:bookmarkEnd w:id="64"/>

</xml_diff>

<commit_message>
Describe the original study as an unpublished working paper; 'reported' instead of 'published' estimates
</commit_message>
<xml_diff>
--- a/manuscript/ESWA_Manuscript_anonymized.docx
+++ b/manuscript/ESWA_Manuscript_anonymized.docx
@@ -25,7 +25,7 @@
         <w:pStyle w:val="FirstParagraph"/>
       </w:pPr>
       <w:r>
-        <w:t xml:space="preserve">Panel threshold regressions suggest that the macroeconomic effects of currency internationalization (CI) depend on institutional quality (IQ). We test whether such evidence improves early warning of exchange-rate stress. A replication-to-deployment framework links a forensic replication of published threshold estimates to a publication-lag-aware pseudo-real-time backtest and a decision layer. With data for nine emerging economies, all 12 published threshold F statistics are reproduced once a degrees-of-freedom convention is identified, but 4 of 8 significant threshold effects disappear under 15% trimming. In a retrospective out-of-time evaluation (2017-2022, 121 high-risk windows), adding CI never raised average precision (AP) by the smallest effect of interest (0.02), and a CI x IQ interaction did not differ from an additive model (Delta AP = -0.006, 95% block-bootstrap interval [-0.026, 0.011]). No learned model beat a persistence rule by more than 0.02 AP with 95% confidence, and in 2021-2022 the persistence rule ranked best (AP 0.535). Short-window recalibration worsened Brier scores for all 7 models, whereas routing low-confidence cases to analysts lowered expected cost relative to random review. In a pre-specified confirmation period (2023-2025, 15 countries) a frozen fallback rule retained the persistence rule in all three years, although XGBoost outperformed it in the nine core economies. Threshold evidence should pass such an audit before it informs deployed early-warning systems.</w:t>
+        <w:t xml:space="preserve">Panel threshold regressions suggest that the macroeconomic effects of currency internationalization (CI) depend on institutional quality (IQ). We test whether such evidence improves early warning of exchange-rate stress. A replication-to-deployment framework links a forensic replication of reported threshold estimates to a publication-lag-aware pseudo-real-time backtest and a decision layer. With data for nine emerging economies, all 12 reported threshold F statistics are reproduced once a degrees-of-freedom convention is identified, but 4 of 8 significant threshold effects disappear under 15% trimming. In a retrospective out-of-time evaluation (2017-2022, 121 high-risk windows), adding CI never raised average precision (AP) by the smallest effect of interest (0.02), and a CI x IQ interaction did not differ from an additive model (Delta AP = -0.006, 95% block-bootstrap interval [-0.026, 0.011]). No learned model beat a persistence rule by more than 0.02 AP with 95% confidence, and in 2021-2022 the persistence rule ranked best (AP 0.535). Short-window recalibration worsened Brier scores for all 7 models, whereas routing low-confidence cases to analysts lowered expected cost relative to random review. In a pre-specified confirmation period (2023-2025, 15 countries) a frozen fallback rule retained the persistence rule in all three years, although XGBoost outperformed it in the nine core economies. Threshold evidence should pass such an audit before it informs deployed early-warning systems.</w:t>
       </w:r>
     </w:p>
     <w:p>
@@ -81,7 +81,7 @@
         </w:numPr>
       </w:pPr>
       <w:r>
-        <w:t xml:space="preserve">RQ1 (replication): Can the published threshold estimates be reproduced from the original data, and how sensitive are they to estimation choices that are rarely reported, such as the trimming of the threshold grid and the timing of information?</w:t>
+        <w:t xml:space="preserve">RQ1 (replication): Can the reported threshold estimates be reproduced from the original data, and how sensitive are they to estimation choices that are rarely reported, such as the trimming of the threshold grid and the timing of information?</w:t>
       </w:r>
     </w:p>
     <w:p>
@@ -113,7 +113,7 @@
         <w:pStyle w:val="FirstParagraph"/>
       </w:pPr>
       <w:r>
-        <w:t xml:space="preserve">We answer these questions with the data behind an earlier, unsubmitted working paper by the authors on CI, IQ and six macroeconomic risks in emerging economies: a SWIFT-share panel of six countries and an FX-turnover-share panel of nine countries. The first stage is a forensic replication of the published threshold tests and regime coefficients. The second stage embeds the same information in a publication-lag-aware pseudo-real-time backtest for three-month real-effective-exchange-rate (REER) stress. Because the period 2021-2022 had been examined while the study was designed, we treat it as a retrospective out-of-time evaluation and add a confirmation period, 2023-2025, that was scored once under a protocol whose SHA-256 hash was recorded beforehand.</w:t>
+        <w:t xml:space="preserve">We answer these questions with the data behind an earlier, unpublished working paper co-authored by one of us on CI, IQ and six macroeconomic risks in emerging economies: a SWIFT-share panel of six countries and an FX-turnover-share panel of nine countries. The first stage is a forensic replication of the reported threshold tests and regime coefficients. The second stage embeds the same information in a publication-lag-aware pseudo-real-time backtest for three-month real-effective-exchange-rate (REER) stress. Because the period 2021-2022 had been examined while the study was designed, we treat it as a retrospective out-of-time evaluation and add a confirmation period, 2023-2025, that was scored once under a protocol whose SHA-256 hash was recorded beforehand.</w:t>
       </w:r>
     </w:p>
     <w:p>
@@ -121,7 +121,7 @@
         <w:pStyle w:val="BodyText"/>
       </w:pPr>
       <w:r>
-        <w:t xml:space="preserve">The answers are largely negative, and we report them as such. The published F statistics are reproduced exactly once an unusual degrees-of-freedom convention is recognised, but several thresholds sit at the edge of the data and lose significance under conventional trimming. CI and IQ do not add detectable forecast value, an institution-conditioned interaction is indistinguishable from an additive model, and a persistence rule is as good as or better than the learned models out of time. The contributions are:</w:t>
+        <w:t xml:space="preserve">The answers are largely negative, and we report them as such. The reported F statistics are reproduced exactly once an unusual degrees-of-freedom convention is recognised, but several thresholds sit at the edge of the data and lose significance under conventional trimming. CI and IQ do not add detectable forecast value, an institution-conditioned interaction is indistinguishable from an additive model, and a persistence rule is as good as or better than the learned models out of time. The contributions are:</w:t>
       </w:r>
     </w:p>
     <w:p>
@@ -133,7 +133,7 @@
         </w:numPr>
       </w:pPr>
       <w:r>
-        <w:t xml:space="preserve">A replication-to-deployment framework that connects a scored replication audit of published panel threshold estimates to a leakage-checked forecasting and decision layer, with every number regenerated from row-level predictions and cross-checked by an automated audit.</w:t>
+        <w:t xml:space="preserve">A replication-to-deployment framework that connects a scored replication audit of reported panel threshold estimates to a leakage-checked forecasting and decision layer, with every number regenerated from row-level predictions and cross-checked by an automated audit.</w:t>
       </w:r>
     </w:p>
     <w:p>
@@ -268,7 +268,7 @@
         <w:pStyle w:val="FirstParagraph"/>
       </w:pPr>
       <w:r>
-        <w:t xml:space="preserve">The replication uses the two regression datasets of the authors’ earlier working paper, which was circulated internally and never submitted. The CI series and macro controls were exported from the Wind Economic Database and compiled into the regression datasets on 13 June 2023; the original Wind series codes were not retained, so Supplementary Table S15 documents the variables by their dataset column names; SHA-256 checksums of the files are recorded in the replication package. Panel A measures CI by the currency’s share of SWIFT payments for China, Hungary, Mexico, Poland, the Russian Federation and South Africa (2012-08 to 2021-12, N = 678). Panel B measures CI by the domestic currency’s share of FX-turnover and adds Brazil, India and Korea (2012-01 to 2022-12, N = 1,188). IQ is the mean of the six WGI dimensions. The six risk indicators are CPI volatility (CPI_Vol), FX-reserve volatility (FX_Vol), consumption volatility (CE_Vol), real exchange-rate volatility (ER_Vol), the credit-to-GDP gap (CG_Gap) and unemployment (Unemp). The Panel B ER_Vol series is available for only 8 of the nine countries, so that regression uses N = 1056. Table 1 summarises the samples.</w:t>
+        <w:t xml:space="preserve">The replication uses the two regression datasets of that earlier working paper, which has not been published. The CI series and macro controls were exported from the Wind Economic Database and compiled into the regression datasets on 13 June 2023; the original Wind series codes were not retained, so Supplementary Table S15 documents the variables by their dataset column names; SHA-256 checksums of the files are recorded in the replication package. Panel A measures CI by the currency’s share of SWIFT payments for China, Hungary, Mexico, Poland, the Russian Federation and South Africa (2012-08 to 2021-12, N = 678). Panel B measures CI by the domestic currency’s share of FX-turnover and adds Brazil, India and Korea (2012-01 to 2022-12, N = 1,188). IQ is the mean of the six WGI dimensions. The six risk indicators are CPI volatility (CPI_Vol), FX-reserve volatility (FX_Vol), consumption volatility (CE_Vol), real exchange-rate volatility (ER_Vol), the credit-to-GDP gap (CG_Gap) and unemployment (Unemp). The Panel B ER_Vol series is available for only 8 of the nine countries, so that regression uses N = 1056. Table 1 summarises the samples.</w:t>
       </w:r>
     </w:p>
     <w:p>
@@ -1609,7 +1609,7 @@
         <w:pStyle w:val="FirstParagraph"/>
       </w:pPr>
       <w:r>
-        <w:t xml:space="preserve">so the smallest attainable value is 0.0005 (Davison &amp; Hinkley, 1997); Monte Carlo standard errors are reported in the replication package. Three choices are not stated in the original paper: the dataset columns behind CE_Vol and ER_Vol, the timing of the other-risk controls and the trimming fraction. We resolve them with a fully reported specification search that scores every candidate against the published F statistics, thresholds and regime t statistics (Supplementary Table S2) and apply the selected option to all twelve regressions: full-coverage series, contemporaneous other risks and 1% trimming, the default of a widely used Stata implementation (Wang, 2015).</w:t>
+        <w:t xml:space="preserve">so the smallest attainable value is 0.0005 (Davison &amp; Hinkley, 1997); Monte Carlo standard errors are reported in the replication package. Three choices are not stated in the original paper: the dataset columns behind CE_Vol and ER_Vol, the timing of the other-risk controls and the trimming fraction. We resolve them with a fully reported specification search that scores every candidate against the reported F statistics, thresholds and regime t statistics (Supplementary Table S2) and apply the selected option to all twelve regressions: full-coverage series, contemporaneous other risks and 1% trimming, the default of a widely used Stata implementation (Wang, 2015).</w:t>
       </w:r>
     </w:p>
     <w:bookmarkEnd w:id="16"/>
@@ -3068,7 +3068,7 @@
         <w:pStyle w:val="FirstParagraph"/>
       </w:pPr>
       <w:r>
-        <w:t xml:space="preserve">The framework runs as scripts in a fixed order. (i) A vintage-aware data module applies each publication lag, holds the last release forward and records data age. (ii) A replication auditor re-estimates the published regressions and classifies each discrepancy as a convention, a suspected transcription error or a non-reproduction. (iii) A forecasting module fits all models on frozen splits and writes row-level predictions to a single prediction store. (iv) A decision module converts probabilities into alerts, review decisions and fallback choices. An audit script recomputes every reported metric from the prediction store and blocks the manuscript build on any mismatch.</w:t>
+        <w:t xml:space="preserve">The framework runs as scripts in a fixed order. (i) A vintage-aware data module applies each publication lag, holds the last release forward and records data age. (ii) A replication auditor re-estimates the reported regressions and classifies each discrepancy as a convention, a suspected transcription error or a non-reproduction. (iii) A forecasting module fits all models on frozen splits and writes row-level predictions to a single prediction store. (iv) A decision module converts probabilities into alerts, review decisions and fallback choices. An audit script recomputes every reported metric from the prediction store and blocks the manuscript build on any mismatch.</w:t>
       </w:r>
     </w:p>
     <w:bookmarkEnd w:id="26"/>
@@ -4308,7 +4308,7 @@
         <w:pStyle w:val="FirstParagraph"/>
       </w:pPr>
       <w:r>
-        <w:t xml:space="preserve">Table 3 compares the replicated threshold tests with the published values. With Hansen’s residual variance the replicated F statistics exceed the published ones by a constant factor within each panel (published/replicated = 0.841 in Panel A and 0.896 in Panel B). Dividing instead by</w:t>
+        <w:t xml:space="preserve">Table 3 compares the replicated threshold tests with the reported values. With Hansen’s residual variance the replicated F statistics exceed the reported ones by a constant factor within each panel (reported/replicated = 0.841 in Panel A and 0.896 in Panel B). Dividing instead by</w:t>
       </w:r>
       <w:r>
         <w:t xml:space="preserve"> </w:t>
@@ -4346,7 +4346,7 @@
         <w:t xml:space="preserve"> </w:t>
       </w:r>
       <w:r>
-        <w:t xml:space="preserve">reproduces 12 of the 12 published F statistics to two decimals, which identifies the convention used. 10 of 12 thresholds are reproduced to four decimals. Of the 24 published regime coefficients, 11 are reproduced in coefficient and t statistic, 3 in the coefficient only and 7 are not reproduced; 3 differ from our estimates only by a digit or a sign and are classified as suspected transcription errors, although we cannot rule out other causes without the original code (Supplementary Table S1).</w:t>
+        <w:t xml:space="preserve">reproduces 12 of the 12 reported F statistics to two decimals, which identifies the convention used. 10 of 12 thresholds are reproduced to four decimals. Of the 24 reported regime coefficients, 11 are reproduced in coefficient and t statistic, 3 in the coefficient only and 7 are not reproduced; 3 differ from our estimates only by a digit or a sign and are classified as suspected transcription errors, although we cannot rule out other causes without the original code (Supplementary Table S1).</w:t>
       </w:r>
     </w:p>
     <w:p>
@@ -4358,7 +4358,7 @@
           <w:b/>
           <w:bCs/>
         </w:rPr>
-        <w:t xml:space="preserve">Table 3. Replication of the published threshold tests (threshold variable: IQ).</w:t>
+        <w:t xml:space="preserve">Table 3. Replication of the reported threshold tests (threshold variable: IQ).</w:t>
       </w:r>
     </w:p>
     <w:tbl>
@@ -4426,7 +4426,7 @@
               <w:pStyle w:val="Compact"/>
             </w:pPr>
             <w:r>
-              <w:t xml:space="preserve">F publ.</w:t>
+              <w:t xml:space="preserve">F rep.</w:t>
             </w:r>
           </w:p>
         </w:tc>
@@ -4470,7 +4470,7 @@
               <w:pStyle w:val="Compact"/>
             </w:pPr>
             <w:r>
-              <w:t xml:space="preserve">Thr. publ.</w:t>
+              <w:t xml:space="preserve">Thr. rep.</w:t>
             </w:r>
           </w:p>
         </w:tc>
@@ -6173,7 +6173,7 @@
           <wp:inline>
             <wp:extent cx="5334000" cy="1830538"/>
             <wp:effectExtent b="0" l="0" r="0" t="0"/>
-            <wp:docPr descr="Fig. 3. Replicated versus published threshold F statistics (a) and bootstrap p-values under 1% trimming, 15% trimming and the pseudo-real-time specification (b)." title="" id="37" name="Picture"/>
+            <wp:docPr descr="Fig. 3. Replicated versus reported threshold F statistics (a) and bootstrap p-values under 1% trimming, 15% trimming and the pseudo-real-time specification (b)." title="" id="37" name="Picture"/>
             <a:graphic>
               <a:graphicData uri="http://schemas.openxmlformats.org/drawingml/2006/picture">
                 <pic:pic>
@@ -6216,7 +6216,7 @@
         <w:pStyle w:val="ImageCaption"/>
       </w:pPr>
       <w:r>
-        <w:t xml:space="preserve">Fig. 3. Replicated versus published threshold F statistics (a) and bootstrap p-values under 1% trimming, 15% trimming and the pseudo-real-time specification (b).</w:t>
+        <w:t xml:space="preserve">Fig. 3. Replicated versus reported threshold F statistics (a) and bootstrap p-values under 1% trimming, 15% trimming and the pseudo-real-time specification (b).</w:t>
       </w:r>
     </w:p>
     <w:bookmarkEnd w:id="39"/>
@@ -12279,7 +12279,7 @@
         <w:pStyle w:val="FirstParagraph"/>
       </w:pPr>
       <w:r>
-        <w:t xml:space="preserve">We traced an institution-conditioned currency-internationalization hypothesis from published threshold estimates to an operational early-warning task. The published tests are reproducible but fragile, and the information they encode does not improve the out-of-sample detection of exchange-rate stress once publication lags, persistence and country identity are taken into account. A pre-specified confirmation period supports this conclusion for the institutional variables, while showing that flexible learners can beat persistence in some samples, which is why a monitored fallback rule is preferable to a fixed model choice. The framework, including its decision rules and consistency audit, can be reused to vet other regression-derived early-warning variables before deployment.</w:t>
+        <w:t xml:space="preserve">We traced an institution-conditioned currency-internationalization hypothesis from reported threshold estimates to an operational early-warning task. The reported tests are reproducible but fragile, and the information they encode does not improve the out-of-sample detection of exchange-rate stress once publication lags, persistence and country identity are taken into account. A pre-specified confirmation period supports this conclusion for the institutional variables, while showing that flexible learners can beat persistence in some samples, which is why a monitored fallback rule is preferable to a fixed model choice. The framework, including its decision rules and consistency audit, can be reused to vet other regression-derived early-warning variables before deployment.</w:t>
       </w:r>
     </w:p>
     <w:bookmarkEnd w:id="63"/>

</xml_diff>